<commit_message>
all docs are updated
</commit_message>
<xml_diff>
--- a/docs/Environment_and_ngrok_Guide.docx
+++ b/docs/Environment_and_ngrok_Guide.docx
@@ -205,7 +205,18 @@
               <w:br/>
               <w:t>DEBUG=True</w:t>
               <w:br/>
-              <w:t>ALLOWED_HOSTS=localhost,127.0.0.1,web</w:t>
+              <w:t># added ngrok urls also</w:t>
+              <w:br/>
+              <w:t>ALLOWED_HOSTS=localhost,127.0.0.1,web,squiggle-dares-trapping.ngrok-free.dev</w:t>
+              <w:br/>
+              <w:br/>
+              <w:t># Stripe Settings</w:t>
+              <w:br/>
+              <w:t>STRIPE_SECRET_KEY=your-stripe-secret-key-here</w:t>
+              <w:br/>
+              <w:t>STRIPE_PUBLISHABLE_KEY=your-stripe-publishable-key-here</w:t>
+              <w:br/>
+              <w:t>STRIPE_WEBHOOK_SECRET=your-stripe-webhook-secret-here</w:t>
             </w:r>
           </w:p>
         </w:tc>
@@ -370,6 +381,96 @@
     </w:p>
     <w:p>
       <w:pPr>
+        <w:pStyle w:val="ListBullet"/>
+        <w:spacing w:before="40" w:after="80" w:line="276" w:lineRule="auto"/>
+        <w:ind w:left="360"/>
+      </w:pPr>
+      <w:r>
+        <w:rPr>
+          <w:rFonts w:ascii="Courier New" w:hAnsi="Courier New"/>
+          <w:b/>
+          <w:color w:val="C7254E"/>
+          <w:sz w:val="19"/>
+        </w:rPr>
+        <w:t>STRIPE_SECRET_KEY</w:t>
+      </w:r>
+      <w:r>
+        <w:t xml:space="preserve">: Stripe secret API key (starts with </w:t>
+      </w:r>
+      <w:r>
+        <w:rPr>
+          <w:rFonts w:ascii="Courier New" w:hAnsi="Courier New"/>
+          <w:color w:val="C7254E"/>
+          <w:sz w:val="19"/>
+        </w:rPr>
+        <w:t>sk_test_</w:t>
+      </w:r>
+      <w:r>
+        <w:t>). Used to perform backend payment intents creations.</w:t>
+      </w:r>
+    </w:p>
+    <w:p>
+      <w:pPr>
+        <w:pStyle w:val="ListBullet"/>
+        <w:spacing w:before="40" w:after="80" w:line="276" w:lineRule="auto"/>
+        <w:ind w:left="360"/>
+      </w:pPr>
+      <w:r>
+        <w:rPr>
+          <w:rFonts w:ascii="Courier New" w:hAnsi="Courier New"/>
+          <w:b/>
+          <w:color w:val="C7254E"/>
+          <w:sz w:val="19"/>
+        </w:rPr>
+        <w:t>STRIPE_PUBLISHABLE_KEY</w:t>
+      </w:r>
+      <w:r>
+        <w:t xml:space="preserve">: Stripe publishable API key (starts with </w:t>
+      </w:r>
+      <w:r>
+        <w:rPr>
+          <w:rFonts w:ascii="Courier New" w:hAnsi="Courier New"/>
+          <w:color w:val="C7254E"/>
+          <w:sz w:val="19"/>
+        </w:rPr>
+        <w:t>pk_test_</w:t>
+      </w:r>
+      <w:r>
+        <w:t>). Used in frontend checkout elements.</w:t>
+      </w:r>
+    </w:p>
+    <w:p>
+      <w:pPr>
+        <w:pStyle w:val="ListBullet"/>
+        <w:spacing w:before="40" w:after="80" w:line="276" w:lineRule="auto"/>
+        <w:ind w:left="360"/>
+      </w:pPr>
+      <w:r>
+        <w:rPr>
+          <w:rFonts w:ascii="Courier New" w:hAnsi="Courier New"/>
+          <w:b/>
+          <w:color w:val="C7254E"/>
+          <w:sz w:val="19"/>
+        </w:rPr>
+        <w:t>STRIPE_WEBHOOK_SECRET</w:t>
+      </w:r>
+      <w:r>
+        <w:t xml:space="preserve">: Stripe webhook signing secret (starts with </w:t>
+      </w:r>
+      <w:r>
+        <w:rPr>
+          <w:rFonts w:ascii="Courier New" w:hAnsi="Courier New"/>
+          <w:color w:val="C7254E"/>
+          <w:sz w:val="19"/>
+        </w:rPr>
+        <w:t>whsec_</w:t>
+      </w:r>
+      <w:r>
+        <w:t>). Used to verify payload integrity on webhooks callbacks.</w:t>
+      </w:r>
+    </w:p>
+    <w:p>
+      <w:pPr>
         <w:spacing w:before="80" w:after="120" w:line="276" w:lineRule="auto"/>
       </w:pPr>
       <w:r>
@@ -434,7 +535,7 @@
           <w:color w:val="4A5568"/>
           <w:sz w:val="24"/>
         </w:rPr>
-        <w:t>Step 1: Download &amp; Install ngrok</w:t>
+        <w:t>Step 1: Download &amp; Install ngrok on Ubuntu</w:t>
       </w:r>
     </w:p>
     <w:p>
@@ -442,65 +543,7 @@
         <w:spacing w:before="80" w:after="120" w:line="276" w:lineRule="auto"/>
       </w:pPr>
       <w:r>
-        <w:t>Download the ngrok client suitable for your Operating System:</w:t>
-      </w:r>
-    </w:p>
-    <w:p>
-      <w:pPr>
-        <w:pStyle w:val="ListBullet"/>
-        <w:spacing w:before="40" w:after="80" w:line="276" w:lineRule="auto"/>
-        <w:ind w:left="360"/>
-      </w:pPr>
-      <w:r>
-        <w:rPr>
-          <w:b/>
-        </w:rPr>
-        <w:t>Linux / macOS / Windows:</w:t>
-      </w:r>
-      <w:r>
-        <w:t xml:space="preserve"> Download from [ngrok.com/download](https://ngrok.com/download)</w:t>
-      </w:r>
-    </w:p>
-    <w:p>
-      <w:pPr>
-        <w:pStyle w:val="ListBullet"/>
-        <w:spacing w:before="40" w:after="80" w:line="276" w:lineRule="auto"/>
-        <w:ind w:left="360"/>
-      </w:pPr>
-      <w:r>
-        <w:t>Add the executable to your system path.</w:t>
-      </w:r>
-    </w:p>
-    <w:p>
-      <w:pPr>
-        <w:spacing w:before="200" w:after="80"/>
-      </w:pPr>
-      <w:r>
-        <w:rPr>
-          <w:b/>
-          <w:color w:val="4A5568"/>
-          <w:sz w:val="24"/>
-        </w:rPr>
-        <w:t>Step 2: Establish the Tunnel</w:t>
-      </w:r>
-    </w:p>
-    <w:p>
-      <w:pPr>
-        <w:spacing w:before="80" w:after="120" w:line="276" w:lineRule="auto"/>
-      </w:pPr>
-      <w:r>
-        <w:t xml:space="preserve">Run the following command in a new terminal window to expose your local port </w:t>
-      </w:r>
-      <w:r>
-        <w:rPr>
-          <w:rFonts w:ascii="Courier New" w:hAnsi="Courier New"/>
-          <w:color w:val="C7254E"/>
-          <w:sz w:val="19"/>
-        </w:rPr>
-        <w:t>8000</w:t>
-      </w:r>
-      <w:r>
-        <w:t>:</w:t>
+        <w:t>Install the official ngrok agent repository and client using the following apt-key commands:</w:t>
       </w:r>
     </w:p>
     <w:tbl>
@@ -537,7 +580,160 @@
                 <w:color w:val="505050"/>
                 <w:sz w:val="18"/>
               </w:rPr>
-              <w:t>ngrok http 8000</w:t>
+              <w:t>curl -sSL https://ngrok-agent.s3.amazonaws.com/ngrok.asc \</w:t>
+              <w:br/>
+              <w:t xml:space="preserve">  | sudo tee /etc/apt/trusted.gpg.d/ngrok.asc &gt;/dev/null \</w:t>
+              <w:br/>
+              <w:t xml:space="preserve">  &amp;&amp; echo "deb https://ngrok-agent.s3.amazonaws.com bookworm main" \</w:t>
+              <w:br/>
+              <w:t xml:space="preserve">  | sudo tee /etc/apt/sources.list.d/ngrok.list \</w:t>
+              <w:br/>
+              <w:t xml:space="preserve">  &amp;&amp; sudo apt update \</w:t>
+              <w:br/>
+              <w:t xml:space="preserve">  &amp;&amp; sudo apt install ngrok</w:t>
+            </w:r>
+          </w:p>
+        </w:tc>
+      </w:tr>
+    </w:tbl>
+    <w:p>
+      <w:pPr>
+        <w:spacing w:before="0" w:after="120"/>
+      </w:pPr>
+    </w:p>
+    <w:p>
+      <w:pPr>
+        <w:spacing w:before="200" w:after="80"/>
+      </w:pPr>
+      <w:r>
+        <w:rPr>
+          <w:b/>
+          <w:color w:val="4A5568"/>
+          <w:sz w:val="24"/>
+        </w:rPr>
+        <w:t>Step 2: Add Authtoken Configuration</w:t>
+      </w:r>
+    </w:p>
+    <w:p>
+      <w:pPr>
+        <w:spacing w:before="80" w:after="120" w:line="276" w:lineRule="auto"/>
+      </w:pPr>
+      <w:r>
+        <w:t>Add your account's authentication token to register the client:</w:t>
+      </w:r>
+    </w:p>
+    <w:tbl>
+      <w:tblPr>
+        <w:tblW w:type="auto" w:w="0"/>
+        <w:tblLayout w:type="fixed"/>
+        <w:tblLook w:firstColumn="1" w:firstRow="1" w:lastColumn="0" w:lastRow="0" w:noHBand="0" w:noVBand="1" w:val="04A0"/>
+      </w:tblPr>
+      <w:tblGrid>
+        <w:gridCol w:w="9360"/>
+      </w:tblGrid>
+      <w:tr>
+        <w:tc>
+          <w:tcPr>
+            <w:tcW w:type="dxa" w:w="9360"/>
+            <w:shd w:fill="F5F5F5"/>
+            <w:tcMar>
+              <w:top w:w="144" w:type="dxa"/>
+              <w:bottom w:w="144" w:type="dxa"/>
+              <w:left w:w="216" w:type="dxa"/>
+              <w:right w:w="216" w:type="dxa"/>
+            </w:tcMar>
+            <w:tcBorders>
+              <w:left w:val="single" w:sz="24" w:space="0" w:color="CCCCCC"/>
+            </w:tcBorders>
+          </w:tcPr>
+          <w:p>
+            <w:pPr>
+              <w:spacing w:before="80" w:after="80"/>
+            </w:pPr>
+            <w:r>
+              <w:rPr>
+                <w:rFonts w:ascii="Courier New" w:hAnsi="Courier New"/>
+                <w:color w:val="505050"/>
+                <w:sz w:val="18"/>
+              </w:rPr>
+              <w:t>ngrok config add-authtoken $YOUR_AUTHTOKEN</w:t>
+            </w:r>
+          </w:p>
+        </w:tc>
+      </w:tr>
+    </w:tbl>
+    <w:p>
+      <w:pPr>
+        <w:spacing w:before="0" w:after="120"/>
+      </w:pPr>
+    </w:p>
+    <w:p>
+      <w:pPr>
+        <w:spacing w:before="200" w:after="80"/>
+      </w:pPr>
+      <w:r>
+        <w:rPr>
+          <w:b/>
+          <w:color w:val="4A5568"/>
+          <w:sz w:val="24"/>
+        </w:rPr>
+        <w:t>Step 3: Establish the Tunnel to local Docker Port 8000</w:t>
+      </w:r>
+    </w:p>
+    <w:p>
+      <w:pPr>
+        <w:spacing w:before="80" w:after="120" w:line="276" w:lineRule="auto"/>
+      </w:pPr>
+      <w:r>
+        <w:t xml:space="preserve">Start the tunnel and bind it to your static domain name, mapping it to port </w:t>
+      </w:r>
+      <w:r>
+        <w:rPr>
+          <w:rFonts w:ascii="Courier New" w:hAnsi="Courier New"/>
+          <w:color w:val="C7254E"/>
+          <w:sz w:val="19"/>
+        </w:rPr>
+        <w:t>8000</w:t>
+      </w:r>
+      <w:r>
+        <w:t xml:space="preserve"> where the Django container is exposed:</w:t>
+      </w:r>
+    </w:p>
+    <w:tbl>
+      <w:tblPr>
+        <w:tblW w:type="auto" w:w="0"/>
+        <w:tblLayout w:type="fixed"/>
+        <w:tblLook w:firstColumn="1" w:firstRow="1" w:lastColumn="0" w:lastRow="0" w:noHBand="0" w:noVBand="1" w:val="04A0"/>
+      </w:tblPr>
+      <w:tblGrid>
+        <w:gridCol w:w="9360"/>
+      </w:tblGrid>
+      <w:tr>
+        <w:tc>
+          <w:tcPr>
+            <w:tcW w:type="dxa" w:w="9360"/>
+            <w:shd w:fill="F5F5F5"/>
+            <w:tcMar>
+              <w:top w:w="144" w:type="dxa"/>
+              <w:bottom w:w="144" w:type="dxa"/>
+              <w:left w:w="216" w:type="dxa"/>
+              <w:right w:w="216" w:type="dxa"/>
+            </w:tcMar>
+            <w:tcBorders>
+              <w:left w:val="single" w:sz="24" w:space="0" w:color="CCCCCC"/>
+            </w:tcBorders>
+          </w:tcPr>
+          <w:p>
+            <w:pPr>
+              <w:spacing w:before="80" w:after="80"/>
+            </w:pPr>
+            <w:r>
+              <w:rPr>
+                <w:rFonts w:ascii="Courier New" w:hAnsi="Courier New"/>
+                <w:color w:val="505050"/>
+                <w:sz w:val="18"/>
+              </w:rPr>
+              <w:t>ngrok http --url=squiggle-dares-trapping.ngrok-free.dev 8000</w:t>
             </w:r>
           </w:p>
         </w:tc>
@@ -553,7 +749,7 @@
         <w:spacing w:before="80" w:after="120" w:line="276" w:lineRule="auto"/>
       </w:pPr>
       <w:r>
-        <w:t xml:space="preserve">This will launch a status screen displaying a public HTTPS URL (e.g., </w:t>
+        <w:t xml:space="preserve">This will launch the ngrok status screen showing active forwarding to </w:t>
       </w:r>
       <w:r>
         <w:rPr>
@@ -561,10 +757,10 @@
           <w:color w:val="C7254E"/>
           <w:sz w:val="19"/>
         </w:rPr>
-        <w:t>https://a1b2-34-56-78.ngrok-free.app</w:t>
+        <w:t>http://localhost:8000</w:t>
       </w:r>
       <w:r>
-        <w:t>).</w:t>
+        <w:t>.</w:t>
       </w:r>
     </w:p>
     <w:p>
@@ -577,7 +773,7 @@
           <w:color w:val="4A5568"/>
           <w:sz w:val="24"/>
         </w:rPr>
-        <w:t>Step 3: Configure Allowed Hosts</w:t>
+        <w:t>Step 4: Configure Allowed Hosts</w:t>
       </w:r>
     </w:p>
     <w:p>
@@ -644,7 +840,7 @@
                 <w:color w:val="505050"/>
                 <w:sz w:val="18"/>
               </w:rPr>
-              <w:t>ALLOWED_HOSTS=localhost,127.0.0.1,web,a1b2-34-56-78.ngrok-free.app</w:t>
+              <w:t>ALLOWED_HOSTS=localhost,127.0.0.1,web,squiggle-dares-trapping.ngrok-free.dev</w:t>
             </w:r>
           </w:p>
         </w:tc>
@@ -668,7 +864,7 @@
           <w:color w:val="C7254E"/>
           <w:sz w:val="19"/>
         </w:rPr>
-        <w:t>a1b2-34-56-78.ngrok-free.app</w:t>
+        <w:t>squiggle-dares-trapping.ngrok-free.dev</w:t>
       </w:r>
       <w:r>
         <w:t xml:space="preserve"> with the actual tunnel URL provided by ngrok).*</w:t>
@@ -684,7 +880,7 @@
           <w:color w:val="4A5568"/>
           <w:sz w:val="24"/>
         </w:rPr>
-        <w:t>Step 4: Configure Webhooks in Dashboards</w:t>
+        <w:t>Step 5: Configure Webhooks in Dashboards</w:t>
       </w:r>
     </w:p>
     <w:p>
@@ -721,7 +917,7 @@
           <w:color w:val="C7254E"/>
           <w:sz w:val="19"/>
         </w:rPr>
-        <w:t>https://a1b2-34-56-78.ngrok-free.app/api/payments/webhook/stripe/</w:t>
+        <w:t>https://squiggle-dares-trapping.ngrok-free.dev/api/payments/webhook/stripe/</w:t>
       </w:r>
     </w:p>
     <w:p>
@@ -750,7 +946,7 @@
           <w:color w:val="C7254E"/>
           <w:sz w:val="19"/>
         </w:rPr>
-        <w:t>https://a1b2-34-56-78.ngrok-free.app/api/payments/webhook/bkash/</w:t>
+        <w:t>https://squiggle-dares-trapping.ngrok-free.dev/api/payments/webhook/bkash/</w:t>
       </w:r>
     </w:p>
     <w:p>

</xml_diff>